<commit_message>
docs: the UX audit records what was fixed, per theme and per story
</commit_message>
<xml_diff>
--- a/docs/ux-audit.docx
+++ b/docs/ux-audit.docx
@@ -36,7 +36,7 @@
           <w:color w:val="4A5059"/>
           <w:sz w:val="20"/>
         </w:rPr>
-        <w:t>Проверка всего интерфейса на локальном стенде. Историй: 125. Проверено живьём: 114, по коду: 11. Дата аудита: 2 октября 2026.</w:t>
+        <w:t>Проверка всего интерфейса на локальном стенде. Историй: 125. Проверено живьём: 114, по коду: 11. Дата аудита: 2 октября 2026. Обновлено после исправлений: у каждой темы и истории отмечено, что сделано и проверено в браузере.</w:t>
       </w:r>
     </w:p>
     <w:p>
@@ -280,6 +280,66 @@
                 <w:sz w:val="19"/>
               </w:rPr>
               <w:t>16</w:t>
+            </w:r>
+          </w:p>
+        </w:tc>
+      </w:tr>
+      <w:tr>
+        <w:tc>
+          <w:tcPr>
+            <w:tcW w:type="dxa" w:w="5102"/>
+          </w:tcPr>
+          <w:p>
+            <w:r/>
+            <w:r>
+              <w:rPr>
+                <w:sz w:val="19"/>
+              </w:rPr>
+              <w:t>Исправлено</w:t>
+            </w:r>
+          </w:p>
+        </w:tc>
+        <w:tc>
+          <w:tcPr>
+            <w:tcW w:type="dxa" w:w="1701"/>
+          </w:tcPr>
+          <w:p>
+            <w:r/>
+            <w:r>
+              <w:rPr>
+                <w:sz w:val="19"/>
+              </w:rPr>
+              <w:t>34</w:t>
+            </w:r>
+          </w:p>
+        </w:tc>
+      </w:tr>
+      <w:tr>
+        <w:tc>
+          <w:tcPr>
+            <w:tcW w:type="dxa" w:w="5102"/>
+          </w:tcPr>
+          <w:p>
+            <w:r/>
+            <w:r>
+              <w:rPr>
+                <w:sz w:val="19"/>
+              </w:rPr>
+              <w:t>Исправлено частично</w:t>
+            </w:r>
+          </w:p>
+        </w:tc>
+        <w:tc>
+          <w:tcPr>
+            <w:tcW w:type="dxa" w:w="1701"/>
+          </w:tcPr>
+          <w:p>
+            <w:r/>
+            <w:r>
+              <w:rPr>
+                <w:sz w:val="19"/>
+              </w:rPr>
+              <w:t>12</w:t>
             </w:r>
           </w:p>
         </w:tc>
@@ -1265,7 +1325,7 @@
         <w:pStyle w:val="Heading1"/>
       </w:pPr>
       <w:r>
-        <w:t>2. Что чинить и в каком порядке</w:t>
+        <w:t>2. Что чинить и что уже починено</w:t>
       </w:r>
     </w:p>
     <w:p>
@@ -1304,6 +1364,20 @@
     </w:p>
     <w:p>
       <w:pPr>
+        <w:spacing w:after="80"/>
+      </w:pPr>
+      <w:r>
+        <w:rPr>
+          <w:b/>
+          <w:i w:val="0"/>
+          <w:color w:val="8A5A00"/>
+          <w:sz w:val="20"/>
+        </w:rPr>
+        <w:t>Статус: ЧАСТИЧНО. Сделано: слоты, подтверждение двойной отметки, перенос после полуночи, обновление при возврате. Осталось: push остальным об отметке, подписи кнопок в спешке, окно отметки в списке.</w:t>
+      </w:r>
+    </w:p>
+    <w:p>
+      <w:pPr>
         <w:spacing w:after="60"/>
       </w:pPr>
       <w:r>
@@ -1368,6 +1442,20 @@
     </w:p>
     <w:p>
       <w:pPr>
+        <w:spacing w:after="80"/>
+      </w:pPr>
+      <w:r>
+        <w:rPr>
+          <w:b/>
+          <w:i w:val="0"/>
+          <w:color w:val="1E7A3C"/>
+          <w:sz w:val="20"/>
+        </w:rPr>
+        <w:t>Статус: ИСПРАВЛЕНО. Сделано полностью.</w:t>
+      </w:r>
+    </w:p>
+    <w:p>
+      <w:pPr>
         <w:spacing w:after="60"/>
       </w:pPr>
       <w:r>
@@ -1432,6 +1520,20 @@
     </w:p>
     <w:p>
       <w:pPr>
+        <w:spacing w:after="80"/>
+      </w:pPr>
+      <w:r>
+        <w:rPr>
+          <w:b/>
+          <w:i w:val="0"/>
+          <w:color w:val="1E7A3C"/>
+          <w:sz w:val="20"/>
+        </w:rPr>
+        <w:t>Статус: ИСПРАВЛЕНО. Сделано полностью: запятая и границы.</w:t>
+      </w:r>
+    </w:p>
+    <w:p>
+      <w:pPr>
         <w:spacing w:after="60"/>
       </w:pPr>
       <w:r>
@@ -1496,6 +1598,20 @@
     </w:p>
     <w:p>
       <w:pPr>
+        <w:spacing w:after="80"/>
+      </w:pPr>
+      <w:r>
+        <w:rPr>
+          <w:b/>
+          <w:i w:val="0"/>
+          <w:color w:val="1E7A3C"/>
+          <w:sz w:val="20"/>
+        </w:rPr>
+        <w:t>Статус: ИСПРАВЛЕНО. Сделано: повтор по умолчанию, срок сертификата, предупреждение о push, час отправки, питомец в тексте и ссылке. Осталось только проверить на реальном телефоне.</w:t>
+      </w:r>
+    </w:p>
+    <w:p>
+      <w:pPr>
         <w:spacing w:after="60"/>
       </w:pPr>
       <w:r>
@@ -1560,6 +1676,20 @@
     </w:p>
     <w:p>
       <w:pPr>
+        <w:spacing w:after="80"/>
+      </w:pPr>
+      <w:r>
+        <w:rPr>
+          <w:b/>
+          <w:i w:val="0"/>
+          <w:color w:val="1E7A3C"/>
+          <w:sz w:val="20"/>
+        </w:rPr>
+        <w:t>Статус: ИСПРАВЛЕНО. Сделано: чтение для члена семьи, подтверждение отзыва, версия профиля, сброс исчезнувшего питомца.</w:t>
+      </w:r>
+    </w:p>
+    <w:p>
+      <w:pPr>
         <w:spacing w:after="60"/>
       </w:pPr>
       <w:r>
@@ -1624,56 +1754,6 @@
     </w:p>
     <w:p>
       <w:pPr>
-        <w:spacing w:after="60"/>
-      </w:pPr>
-      <w:r>
-        <w:rPr>
-          <w:b/>
-        </w:rPr>
-        <w:t xml:space="preserve">Проблема. </w:t>
-      </w:r>
-      <w:r>
-        <w:t>После «Записать прививку» с полосы по сертификату полоса и красная точка остаются. «Оформить как запись» падает с «Повтор раньше самой записи». Просроченная запись старше десятой даёт точку без полосы. Замена старой записи идёт только по точному названию, «Чумка» и «Чумка (Эурикан)» остались обе. Просрочка лекарства у другого питомца нигде не сигнализируется.</w:t>
-      </w:r>
-    </w:p>
-    <w:p>
-      <w:pPr>
-        <w:spacing w:after="60"/>
-      </w:pPr>
-      <w:r>
-        <w:rPr>
-          <w:b/>
-        </w:rPr>
-        <w:t xml:space="preserve">Как исправить. </w:t>
-      </w:r>
-      <w:r>
-        <w:t>Кнопка полосы по сертификату открывает форму с привязкой документа, просроченный срок не подставляется. Считать просрочку по всем записям, а не по десяти. Предлагать «заменить прежнюю запись?» при близком названии. Подпись переключателя питомцев учитывает и лекарства.</w:t>
-      </w:r>
-    </w:p>
-    <w:p>
-      <w:pPr>
-        <w:spacing w:after="60"/>
-      </w:pPr>
-      <w:r>
-        <w:rPr>
-          <w:b/>
-        </w:rPr>
-        <w:t xml:space="preserve">Истории: </w:t>
-      </w:r>
-      <w:r>
-        <w:t>A4-12, A4-10, A4-11, A4-09</w:t>
-      </w:r>
-    </w:p>
-    <w:p>
-      <w:pPr>
-        <w:pStyle w:val="Heading2"/>
-      </w:pPr>
-      <w:r>
-        <w:t>7. Нет сети и тихие отказы</w:t>
-      </w:r>
-    </w:p>
-    <w:p>
-      <w:pPr>
         <w:spacing w:after="80"/>
       </w:pPr>
       <w:r>
@@ -1683,7 +1763,7 @@
           <w:color w:val="8A5A00"/>
           <w:sz w:val="20"/>
         </w:rPr>
-        <w:t>Приоритет P1, размер M</w:t>
+        <w:t>Статус: ЧАСТИЧНО. Сделано: полоса по всем записям, сертификат и новая прививка, подсказка о близком названии. Осталось: замена по близкому названию автоматически, подпись переключателя питомцев по лекарствам.</w:t>
       </w:r>
     </w:p>
     <w:p>
@@ -1697,7 +1777,7 @@
         <w:t xml:space="preserve">Проблема. </w:t>
       </w:r>
       <w:r>
-        <w:t>Без сети «Сохранить» превращается в бесконечный спиннер, а запись сохраняется сама при появлении связи, так что человек вводит её снова и получает дубль. Экспорт пустого питомца пишет «Не удалось экспортировать», нули в экспорте выходят пустыми, удаление типа с записями обещает и тут же отказывает.</w:t>
+        <w:t>После «Записать прививку» с полосы по сертификату полоса и красная точка остаются. «Оформить как запись» падает с «Повтор раньше самой записи». Просроченная запись старше десятой даёт точку без полосы. Замена старой записи идёт только по точному названию, «Чумка» и «Чумка (Эурикан)» остались обе. Просрочка лекарства у другого питомца нигде не сигнализируется.</w:t>
       </w:r>
     </w:p>
     <w:p>
@@ -1711,7 +1791,7 @@
         <w:t xml:space="preserve">Как исправить. </w:t>
       </w:r>
       <w:r>
-        <w:t>Определять отсутствие сети и сразу писать «Нет связи, запись не сохранена» либо честно «Запишем, когда появится связь». Таймаут запроса, предупреждение о дубле. Экспорт: «Нет данных». Нули писать как 0.</w:t>
+        <w:t>Кнопка полосы по сертификату открывает форму с привязкой документа, просроченный срок не подставляется. Считать просрочку по всем записям, а не по десяти. Предлагать «заменить прежнюю запись?» при близком названии. Подпись переключателя питомцев учитывает и лекарства.</w:t>
       </w:r>
     </w:p>
     <w:p>
@@ -1725,7 +1805,7 @@
         <w:t xml:space="preserve">Истории: </w:t>
       </w:r>
       <w:r>
-        <w:t>A4-24, A3-29, A1-09, A2-27, A2-22</w:t>
+        <w:t>A4-12, A4-10, A4-11, A4-09</w:t>
       </w:r>
     </w:p>
     <w:p>
@@ -1733,7 +1813,7 @@
         <w:pStyle w:val="Heading2"/>
       </w:pPr>
       <w:r>
-        <w:t>8. Пустые состояния и ввод без проверки</w:t>
+        <w:t>7. Нет сети и тихие отказы</w:t>
       </w:r>
     </w:p>
     <w:p>
@@ -1747,57 +1827,7 @@
           <w:color w:val="8A5A00"/>
           <w:sz w:val="20"/>
         </w:rPr>
-        <w:t>Приоритет P1, размер S</w:t>
-      </w:r>
-    </w:p>
-    <w:p>
-      <w:pPr>
-        <w:spacing w:after="60"/>
-      </w:pPr>
-      <w:r>
-        <w:rPr>
-          <w:b/>
-        </w:rPr>
-        <w:t xml:space="preserve">Проблема. </w:t>
-      </w:r>
-      <w:r>
-        <w:t>«Документы» и «История» без питомца показывают пустой экран (текст спрятан под верхней панелью). Питомец с именем из пробелов создаётся (сервер отвечает 201). Три одинаковых времени 08:00 сохраняются, учёт остатков включается без остатка и тихо не работает.</w:t>
-      </w:r>
-    </w:p>
-    <w:p>
-      <w:pPr>
-        <w:spacing w:after="60"/>
-      </w:pPr>
-      <w:r>
-        <w:rPr>
-          <w:b/>
-        </w:rPr>
-        <w:t xml:space="preserve">Как исправить. </w:t>
-      </w:r>
-      <w:r>
-        <w:t>Общий экран «Сначала добавьте питомца» с кнопкой. Обрезать пробелы и требовать непустое имя на сервере и в форме. Проверять дубли времён и обязательный остаток при включённом учёте.</w:t>
-      </w:r>
-    </w:p>
-    <w:p>
-      <w:pPr>
-        <w:spacing w:after="60"/>
-      </w:pPr>
-      <w:r>
-        <w:rPr>
-          <w:b/>
-        </w:rPr>
-        <w:t xml:space="preserve">Истории: </w:t>
-      </w:r>
-      <w:r>
-        <w:t>A1-04, A1-05, A1-12, A3-03, A3-05, A2-07</w:t>
-      </w:r>
-    </w:p>
-    <w:p>
-      <w:pPr>
-        <w:pStyle w:val="Heading2"/>
-      </w:pPr>
-      <w:r>
-        <w:t>9. Время и часовые пояса</w:t>
+        <w:t>Приоритет P1, размер M</w:t>
       </w:r>
     </w:p>
     <w:p>
@@ -1811,7 +1841,163 @@
           <w:color w:val="8A5A00"/>
           <w:sz w:val="20"/>
         </w:rPr>
+        <w:t>Статус: ЧАСТИЧНО. Сделано: сохранение без связи, экспорт. Осталось: удаление типа события с записями, офлайн-очередь.</w:t>
+      </w:r>
+    </w:p>
+    <w:p>
+      <w:pPr>
+        <w:spacing w:after="60"/>
+      </w:pPr>
+      <w:r>
+        <w:rPr>
+          <w:b/>
+        </w:rPr>
+        <w:t xml:space="preserve">Проблема. </w:t>
+      </w:r>
+      <w:r>
+        <w:t>Без сети «Сохранить» превращается в бесконечный спиннер, а запись сохраняется сама при появлении связи, так что человек вводит её снова и получает дубль. Экспорт пустого питомца пишет «Не удалось экспортировать», нули в экспорте выходят пустыми, удаление типа с записями обещает и тут же отказывает.</w:t>
+      </w:r>
+    </w:p>
+    <w:p>
+      <w:pPr>
+        <w:spacing w:after="60"/>
+      </w:pPr>
+      <w:r>
+        <w:rPr>
+          <w:b/>
+        </w:rPr>
+        <w:t xml:space="preserve">Как исправить. </w:t>
+      </w:r>
+      <w:r>
+        <w:t>Определять отсутствие сети и сразу писать «Нет связи, запись не сохранена» либо честно «Запишем, когда появится связь». Таймаут запроса, предупреждение о дубле. Экспорт: «Нет данных». Нули писать как 0.</w:t>
+      </w:r>
+    </w:p>
+    <w:p>
+      <w:pPr>
+        <w:spacing w:after="60"/>
+      </w:pPr>
+      <w:r>
+        <w:rPr>
+          <w:b/>
+        </w:rPr>
+        <w:t xml:space="preserve">Истории: </w:t>
+      </w:r>
+      <w:r>
+        <w:t>A4-24, A3-29, A1-09, A2-27, A2-22</w:t>
+      </w:r>
+    </w:p>
+    <w:p>
+      <w:pPr>
+        <w:pStyle w:val="Heading2"/>
+      </w:pPr>
+      <w:r>
+        <w:t>8. Пустые состояния и ввод без проверки</w:t>
+      </w:r>
+    </w:p>
+    <w:p>
+      <w:pPr>
+        <w:spacing w:after="80"/>
+      </w:pPr>
+      <w:r>
+        <w:rPr>
+          <w:b/>
+          <w:i w:val="0"/>
+          <w:color w:val="8A5A00"/>
+          <w:sz w:val="20"/>
+        </w:rPr>
         <w:t>Приоритет P1, размер S</w:t>
+      </w:r>
+    </w:p>
+    <w:p>
+      <w:pPr>
+        <w:spacing w:after="80"/>
+      </w:pPr>
+      <w:r>
+        <w:rPr>
+          <w:b/>
+          <w:i w:val="0"/>
+          <w:color w:val="8A5A00"/>
+          <w:sz w:val="20"/>
+        </w:rPr>
+        <w:t>Статус: ЧАСТИЧНО. Сделано: пустые экраны, имя из пробелов, повторяющиеся времена, остаток. Осталось: вкладка «Медкарта» без питомца, пустое обязательное поле.</w:t>
+      </w:r>
+    </w:p>
+    <w:p>
+      <w:pPr>
+        <w:spacing w:after="60"/>
+      </w:pPr>
+      <w:r>
+        <w:rPr>
+          <w:b/>
+        </w:rPr>
+        <w:t xml:space="preserve">Проблема. </w:t>
+      </w:r>
+      <w:r>
+        <w:t>«Документы» и «История» без питомца показывают пустой экран (текст спрятан под верхней панелью). Питомец с именем из пробелов создаётся (сервер отвечает 201). Три одинаковых времени 08:00 сохраняются, учёт остатков включается без остатка и тихо не работает.</w:t>
+      </w:r>
+    </w:p>
+    <w:p>
+      <w:pPr>
+        <w:spacing w:after="60"/>
+      </w:pPr>
+      <w:r>
+        <w:rPr>
+          <w:b/>
+        </w:rPr>
+        <w:t xml:space="preserve">Как исправить. </w:t>
+      </w:r>
+      <w:r>
+        <w:t>Общий экран «Сначала добавьте питомца» с кнопкой. Обрезать пробелы и требовать непустое имя на сервере и в форме. Проверять дубли времён и обязательный остаток при включённом учёте.</w:t>
+      </w:r>
+    </w:p>
+    <w:p>
+      <w:pPr>
+        <w:spacing w:after="60"/>
+      </w:pPr>
+      <w:r>
+        <w:rPr>
+          <w:b/>
+        </w:rPr>
+        <w:t xml:space="preserve">Истории: </w:t>
+      </w:r>
+      <w:r>
+        <w:t>A1-04, A1-05, A1-12, A3-03, A3-05, A2-07</w:t>
+      </w:r>
+    </w:p>
+    <w:p>
+      <w:pPr>
+        <w:pStyle w:val="Heading2"/>
+      </w:pPr>
+      <w:r>
+        <w:t>9. Время и часовые пояса</w:t>
+      </w:r>
+    </w:p>
+    <w:p>
+      <w:pPr>
+        <w:spacing w:after="80"/>
+      </w:pPr>
+      <w:r>
+        <w:rPr>
+          <w:b/>
+          <w:i w:val="0"/>
+          <w:color w:val="8A5A00"/>
+          <w:sz w:val="20"/>
+        </w:rPr>
+        <w:t>Приоритет P1, размер S</w:t>
+      </w:r>
+    </w:p>
+    <w:p>
+      <w:pPr>
+        <w:spacing w:after="80"/>
+      </w:pPr>
+      <w:r>
+        <w:rPr>
+          <w:b/>
+          <w:i w:val="0"/>
+          <w:color w:val="8A5A00"/>
+          <w:sz w:val="20"/>
+        </w:rPr>
+        <w:t>Статус: ЧАСТИЧНО. Сделано: время документов, склонения, время в пределах недели. Осталось: часовые пояса в ленте и у члена семьи.</w:t>
       </w:r>
     </w:p>
     <w:p>
@@ -1876,6 +2062,20 @@
           <w:sz w:val="20"/>
         </w:rPr>
         <w:t>Приоритет P2, размер M</w:t>
+      </w:r>
+    </w:p>
+    <w:p>
+      <w:pPr>
+        <w:spacing w:after="80"/>
+      </w:pPr>
+      <w:r>
+        <w:rPr>
+          <w:b/>
+          <w:i w:val="0"/>
+          <w:color w:val="8A5A00"/>
+          <w:sz w:val="20"/>
+        </w:rPr>
+        <w:t>Статус: ЧАСТИЧНО. Сделано: тема, фокус, поиск в справке, тип записи, имя питомца, подсветка «Настроек», зоны нажатия. Осталось: подсказка о свайпе, клавиатурный доступ к карточкам и шторке «+».</w:t>
       </w:r>
     </w:p>
     <w:p>
@@ -3069,6 +3269,18 @@
       <w:r>
         <w:rPr>
           <w:b/>
+          <w:color w:val="1E7A3C"/>
+        </w:rPr>
+        <w:t>ИСПРАВЛЕНО. «Документы» и «История» без питомца показывают «Сначала добавьте питомца» с кнопкой.</w:t>
+      </w:r>
+    </w:p>
+    <w:p>
+      <w:pPr>
+        <w:spacing w:after="60"/>
+      </w:pPr>
+      <w:r>
+        <w:rPr>
+          <w:b/>
         </w:rPr>
         <w:t xml:space="preserve">История. </w:t>
       </w:r>
@@ -3165,6 +3377,18 @@
       <w:r>
         <w:rPr>
           <w:b/>
+          <w:color w:val="8A5A00"/>
+        </w:rPr>
+        <w:t>ЧАСТИЧНО. Вкладка «Медкарта» без питомца по-прежнему ведёт в список питомцев без подсветки.</w:t>
+      </w:r>
+    </w:p>
+    <w:p>
+      <w:pPr>
+        <w:spacing w:after="60"/>
+      </w:pPr>
+      <w:r>
+        <w:rPr>
+          <w:b/>
         </w:rPr>
         <w:t xml:space="preserve">История. </w:t>
       </w:r>
@@ -3837,6 +4061,18 @@
       <w:r>
         <w:rPr>
           <w:b/>
+          <w:color w:val="1E7A3C"/>
+        </w:rPr>
+        <w:t>ИСПРАВЛЕНО. Имя из пробелов не принимается ни формой, ни сервером, пробелы по краям срезаются.</w:t>
+      </w:r>
+    </w:p>
+    <w:p>
+      <w:pPr>
+        <w:spacing w:after="60"/>
+      </w:pPr>
+      <w:r>
+        <w:rPr>
+          <w:b/>
         </w:rPr>
         <w:t xml:space="preserve">История. </w:t>
       </w:r>
@@ -4111,6 +4347,18 @@
       <w:r>
         <w:rPr>
           <w:b/>
+          <w:color w:val="1E7A3C"/>
+        </w:rPr>
+        <w:t>ИСПРАВЛЕНО. «Отменить» после приглашения не затирается, в тексте сказано, что может член семьи.</w:t>
+      </w:r>
+    </w:p>
+    <w:p>
+      <w:pPr>
+        <w:spacing w:after="60"/>
+      </w:pPr>
+      <w:r>
+        <w:rPr>
+          <w:b/>
         </w:rPr>
         <w:t xml:space="preserve">История. </w:t>
       </w:r>
@@ -4303,6 +4551,18 @@
       <w:r>
         <w:rPr>
           <w:b/>
+          <w:color w:val="1E7A3C"/>
+        </w:rPr>
+        <w:t>ИСПРАВЛЕНО. Карточка питомца и плитки у члена семьи только для чтения, с пояснением.</w:t>
+      </w:r>
+    </w:p>
+    <w:p>
+      <w:pPr>
+        <w:spacing w:after="60"/>
+      </w:pPr>
+      <w:r>
+        <w:rPr>
+          <w:b/>
         </w:rPr>
         <w:t xml:space="preserve">История. </w:t>
       </w:r>
@@ -4399,6 +4659,18 @@
       <w:r>
         <w:rPr>
           <w:b/>
+          <w:color w:val="8A5A00"/>
+        </w:rPr>
+        <w:t>ЧАСТИЧНО. Выбор сбрасывается и человеку сказано, что питомец недоступен. Онбординг у бывшего члена семьи показывается по-прежнему.</w:t>
+      </w:r>
+    </w:p>
+    <w:p>
+      <w:pPr>
+        <w:spacing w:after="60"/>
+      </w:pPr>
+      <w:r>
+        <w:rPr>
+          <w:b/>
         </w:rPr>
         <w:t xml:space="preserve">История. </w:t>
       </w:r>
@@ -4769,6 +5041,18 @@
       <w:r>
         <w:rPr>
           <w:b/>
+          <w:color w:val="1E7A3C"/>
+        </w:rPr>
+        <w:t>ИСПРАВЛЕНО. Две переключателя темы заменены одним выбором из трёх.</w:t>
+      </w:r>
+    </w:p>
+    <w:p>
+      <w:pPr>
+        <w:spacing w:after="60"/>
+      </w:pPr>
+      <w:r>
+        <w:rPr>
+          <w:b/>
         </w:rPr>
         <w:t xml:space="preserve">История. </w:t>
       </w:r>
@@ -5057,6 +5341,18 @@
       <w:r>
         <w:rPr>
           <w:b/>
+          <w:color w:val="1E7A3C"/>
+        </w:rPr>
+        <w:t>ИСПРАВЛЕНО. Встроенные значения убраны, поля пустые, пока человек не задаст свои.</w:t>
+      </w:r>
+    </w:p>
+    <w:p>
+      <w:pPr>
+        <w:spacing w:after="60"/>
+      </w:pPr>
+      <w:r>
+        <w:rPr>
+          <w:b/>
         </w:rPr>
         <w:t xml:space="preserve">История. </w:t>
       </w:r>
@@ -5153,6 +5449,18 @@
       <w:r>
         <w:rPr>
           <w:b/>
+          <w:color w:val="1E7A3C"/>
+        </w:rPr>
+        <w:t>ИСПРАВЛЕНО. В справке есть поиск, тексты сверены с интерфейсом.</w:t>
+      </w:r>
+    </w:p>
+    <w:p>
+      <w:pPr>
+        <w:spacing w:after="60"/>
+      </w:pPr>
+      <w:r>
+        <w:rPr>
+          <w:b/>
         </w:rPr>
         <w:t xml:space="preserve">История. </w:t>
       </w:r>
@@ -5345,6 +5653,18 @@
       <w:r>
         <w:rPr>
           <w:b/>
+          <w:color w:val="1E7A3C"/>
+        </w:rPr>
+        <w:t>ИСПРАВЛЕНО. «Настройки» подсвечены на экранах, которые из них открываются.</w:t>
+      </w:r>
+    </w:p>
+    <w:p>
+      <w:pPr>
+        <w:spacing w:after="60"/>
+      </w:pPr>
+      <w:r>
+        <w:rPr>
+          <w:b/>
         </w:rPr>
         <w:t xml:space="preserve">История. </w:t>
       </w:r>
@@ -5441,6 +5761,18 @@
       <w:r>
         <w:rPr>
           <w:b/>
+          <w:color w:val="1E7A3C"/>
+        </w:rPr>
+        <w:t>ИСПРАВЛЕНО. У строки формы с курсором видна линия фокуса.</w:t>
+      </w:r>
+    </w:p>
+    <w:p>
+      <w:pPr>
+        <w:spacing w:after="60"/>
+      </w:pPr>
+      <w:r>
+        <w:rPr>
+          <w:b/>
         </w:rPr>
         <w:t xml:space="preserve">История. </w:t>
       </w:r>
@@ -5901,6 +6233,18 @@
       <w:r>
         <w:rPr>
           <w:b/>
+          <w:color w:val="1E7A3C"/>
+        </w:rPr>
+        <w:t>ИСПРАВЛЕНО. Запятая принимается во всех числовых полях событий.</w:t>
+      </w:r>
+    </w:p>
+    <w:p>
+      <w:pPr>
+        <w:spacing w:after="60"/>
+      </w:pPr>
+      <w:r>
+        <w:rPr>
+          <w:b/>
         </w:rPr>
         <w:t xml:space="preserve">История. </w:t>
       </w:r>
@@ -6079,6 +6423,18 @@
       <w:r>
         <w:rPr>
           <w:b/>
+          <w:color w:val="1E7A3C"/>
+        </w:rPr>
+        <w:t>ИСПРАВЛЕНО. Новый аккаунт открывает формы пустыми.</w:t>
+      </w:r>
+    </w:p>
+    <w:p>
+      <w:pPr>
+        <w:spacing w:after="60"/>
+      </w:pPr>
+      <w:r>
+        <w:rPr>
+          <w:b/>
         </w:rPr>
         <w:t xml:space="preserve">История. </w:t>
       </w:r>
@@ -6175,6 +6531,18 @@
       <w:r>
         <w:rPr>
           <w:b/>
+          <w:color w:val="1E7A3C"/>
+        </w:rPr>
+        <w:t>ИСПРАВЛЕНО. Сохранённый вариант, которого форма не предлагает, не применяется; список вариантов выровнен.</w:t>
+      </w:r>
+    </w:p>
+    <w:p>
+      <w:pPr>
+        <w:spacing w:after="60"/>
+      </w:pPr>
+      <w:r>
+        <w:rPr>
+          <w:b/>
         </w:rPr>
         <w:t xml:space="preserve">История. </w:t>
       </w:r>
@@ -6367,6 +6735,18 @@
       <w:r>
         <w:rPr>
           <w:b/>
+          <w:color w:val="1E7A3C"/>
+        </w:rPr>
+        <w:t>ИСПРАВЛЕНО. Вес 0 и порция 99999 г отклоняются формой и сервером.</w:t>
+      </w:r>
+    </w:p>
+    <w:p>
+      <w:pPr>
+        <w:spacing w:after="60"/>
+      </w:pPr>
+      <w:r>
+        <w:rPr>
+          <w:b/>
         </w:rPr>
         <w:t xml:space="preserve">История. </w:t>
       </w:r>
@@ -6463,6 +6843,18 @@
       <w:r>
         <w:rPr>
           <w:b/>
+          <w:color w:val="8A5A00"/>
+        </w:rPr>
+        <w:t>ЧАСТИЧНО. Тип записи назван, склонения верны, время видно в пределах недели; дубль «сегодня» в заголовке дня остаётся.</w:t>
+      </w:r>
+    </w:p>
+    <w:p>
+      <w:pPr>
+        <w:spacing w:after="60"/>
+      </w:pPr>
+      <w:r>
+        <w:rPr>
+          <w:b/>
         </w:rPr>
         <w:t xml:space="preserve">История. </w:t>
       </w:r>
@@ -7189,6 +7581,18 @@
       <w:r>
         <w:rPr>
           <w:b/>
+          <w:color w:val="1E7A3C"/>
+        </w:rPr>
+        <w:t>ИСПРАВЛЕНО. В формах события и лекарства названо имя питомца.</w:t>
+      </w:r>
+    </w:p>
+    <w:p>
+      <w:pPr>
+        <w:spacing w:after="60"/>
+      </w:pPr>
+      <w:r>
+        <w:rPr>
+          <w:b/>
         </w:rPr>
         <w:t xml:space="preserve">История. </w:t>
       </w:r>
@@ -7477,6 +7881,18 @@
       <w:r>
         <w:rPr>
           <w:b/>
+          <w:color w:val="1E7A3C"/>
+        </w:rPr>
+        <w:t>ИСПРАВЛЕНО. Плитки у члена семьи неактивны с пояснением, отказ сервера больше не молчит.</w:t>
+      </w:r>
+    </w:p>
+    <w:p>
+      <w:pPr>
+        <w:spacing w:after="60"/>
+      </w:pPr>
+      <w:r>
+        <w:rPr>
+          <w:b/>
         </w:rPr>
         <w:t xml:space="preserve">История. </w:t>
       </w:r>
@@ -7861,6 +8277,18 @@
       <w:r>
         <w:rPr>
           <w:b/>
+          <w:color w:val="1E7A3C"/>
+        </w:rPr>
+        <w:t>ИСПРАВЛЕНО. В Настройках есть строка «История записей».</w:t>
+      </w:r>
+    </w:p>
+    <w:p>
+      <w:pPr>
+        <w:spacing w:after="60"/>
+      </w:pPr>
+      <w:r>
+        <w:rPr>
+          <w:b/>
         </w:rPr>
         <w:t xml:space="preserve">История. </w:t>
       </w:r>
@@ -8149,6 +8577,18 @@
       <w:r>
         <w:rPr>
           <w:b/>
+          <w:color w:val="1E7A3C"/>
+        </w:rPr>
+        <w:t>ИСПРАВЛЕНО. Ноль выгружается нулём, пустой экспорт говорит «нет записей».</w:t>
+      </w:r>
+    </w:p>
+    <w:p>
+      <w:pPr>
+        <w:spacing w:after="60"/>
+      </w:pPr>
+      <w:r>
+        <w:rPr>
+          <w:b/>
         </w:rPr>
         <w:t xml:space="preserve">История. </w:t>
       </w:r>
@@ -9007,6 +9447,18 @@
       <w:r>
         <w:rPr>
           <w:b/>
+          <w:color w:val="1E7A3C"/>
+        </w:rPr>
+        <w:t>ИСПРАВЛЕНО. Повторяющееся время хранится один раз по порядку, «+ Время» ставит следующий час.</w:t>
+      </w:r>
+    </w:p>
+    <w:p>
+      <w:pPr>
+        <w:spacing w:after="60"/>
+      </w:pPr>
+      <w:r>
+        <w:rPr>
+          <w:b/>
         </w:rPr>
         <w:t xml:space="preserve">История. </w:t>
       </w:r>
@@ -9185,6 +9637,18 @@
       <w:r>
         <w:rPr>
           <w:b/>
+          <w:color w:val="1E7A3C"/>
+        </w:rPr>
+        <w:t>ИСПРАВЛЕНО. Включённый учёт остатков требует указать остаток.</w:t>
+      </w:r>
+    </w:p>
+    <w:p>
+      <w:pPr>
+        <w:spacing w:after="60"/>
+      </w:pPr>
+      <w:r>
+        <w:rPr>
+          <w:b/>
         </w:rPr>
         <w:t xml:space="preserve">История. </w:t>
       </w:r>
@@ -9281,6 +9745,18 @@
       <w:r>
         <w:rPr>
           <w:b/>
+          <w:color w:val="1E7A3C"/>
+        </w:rPr>
+        <w:t>ИСПРАВЛЕНО. Приём закрывает свой слот: ближайший по времени, а из виджета ровно тот, для которого отмечен.</w:t>
+      </w:r>
+    </w:p>
+    <w:p>
+      <w:pPr>
+        <w:spacing w:after="60"/>
+      </w:pPr>
+      <w:r>
+        <w:rPr>
+          <w:b/>
         </w:rPr>
         <w:t xml:space="preserve">История. </w:t>
       </w:r>
@@ -9459,6 +9935,18 @@
       <w:r>
         <w:rPr>
           <w:b/>
+          <w:color w:val="1E7A3C"/>
+        </w:rPr>
+        <w:t>ИСПРАВЛЕНО. После «Принять сейчас» виджет не предлагает тот же слот заново; второй приём рядом по времени спрашивает подтверждение.</w:t>
+      </w:r>
+    </w:p>
+    <w:p>
+      <w:pPr>
+        <w:spacing w:after="60"/>
+      </w:pPr>
+      <w:r>
+        <w:rPr>
+          <w:b/>
         </w:rPr>
         <w:t xml:space="preserve">История. </w:t>
       </w:r>
@@ -10021,6 +10509,18 @@
       <w:r>
         <w:rPr>
           <w:b/>
+          <w:color w:val="1E7A3C"/>
+        </w:rPr>
+        <w:t>ИСПРАВЛЕНО. Вчерашний неотмеченный приём остаётся в виджете до 6 часов после полуночи и закрывается вчерашним слотом.</w:t>
+      </w:r>
+    </w:p>
+    <w:p>
+      <w:pPr>
+        <w:spacing w:after="60"/>
+      </w:pPr>
+      <w:r>
+        <w:rPr>
+          <w:b/>
         </w:rPr>
         <w:t xml:space="preserve">История. </w:t>
       </w:r>
@@ -10117,6 +10617,18 @@
       <w:r>
         <w:rPr>
           <w:b/>
+          <w:color w:val="1E7A3C"/>
+        </w:rPr>
+        <w:t>ИСПРАВЛЕНО. Сервер отвечает 409 с именем и временем, приложение спрашивает «Записать ещё один?».</w:t>
+      </w:r>
+    </w:p>
+    <w:p>
+      <w:pPr>
+        <w:spacing w:after="60"/>
+      </w:pPr>
+      <w:r>
+        <w:rPr>
+          <w:b/>
         </w:rPr>
         <w:t xml:space="preserve">История. </w:t>
       </w:r>
@@ -10213,6 +10725,18 @@
       <w:r>
         <w:rPr>
           <w:b/>
+          <w:color w:val="8A5A00"/>
+        </w:rPr>
+        <w:t>ЧАСТИЧНО. Лента и списки обновляются при возврате и раз в 30 секунд, при двойной отметке называется автор. Push остальным об отметке не отправляется.</w:t>
+      </w:r>
+    </w:p>
+    <w:p>
+      <w:pPr>
+        <w:spacing w:after="60"/>
+      </w:pPr>
+      <w:r>
+        <w:rPr>
+          <w:b/>
         </w:rPr>
         <w:t xml:space="preserve">История. </w:t>
       </w:r>
@@ -10309,6 +10833,18 @@
       <w:r>
         <w:rPr>
           <w:b/>
+          <w:color w:val="8A5A00"/>
+        </w:rPr>
+        <w:t>ЧАСТИЧНО. Добавлен вчерашний приём в виджете; остальные состояния виджета не менялись.</w:t>
+      </w:r>
+    </w:p>
+    <w:p>
+      <w:pPr>
+        <w:spacing w:after="60"/>
+      </w:pPr>
+      <w:r>
+        <w:rPr>
+          <w:b/>
         </w:rPr>
         <w:t xml:space="preserve">История. </w:t>
       </w:r>
@@ -11035,6 +11571,18 @@
       <w:r>
         <w:rPr>
           <w:b/>
+          <w:color w:val="8A5A00"/>
+        </w:rPr>
+        <w:t>ЧАСТИЧНО. Курс без расписания теперь можно отмечать; лишний приём при закрытых слотах по-прежнему недоступен.</w:t>
+      </w:r>
+    </w:p>
+    <w:p>
+      <w:pPr>
+        <w:spacing w:after="60"/>
+      </w:pPr>
+      <w:r>
+        <w:rPr>
+          <w:b/>
         </w:rPr>
         <w:t xml:space="preserve">История. </w:t>
       </w:r>
@@ -11227,6 +11775,18 @@
       <w:r>
         <w:rPr>
           <w:b/>
+          <w:color w:val="8A5A00"/>
+        </w:rPr>
+        <w:t>ЧАСТИЧНО. Push называет питомца и открывает его. Просрочка лекарства у другого питомца в переключателе по-прежнему не видна.</w:t>
+      </w:r>
+    </w:p>
+    <w:p>
+      <w:pPr>
+        <w:spacing w:after="60"/>
+      </w:pPr>
+      <w:r>
+        <w:rPr>
+          <w:b/>
         </w:rPr>
         <w:t xml:space="preserve">История. </w:t>
       </w:r>
@@ -11323,6 +11883,18 @@
       <w:r>
         <w:rPr>
           <w:b/>
+          <w:color w:val="8A5A00"/>
+        </w:rPr>
+        <w:t>ЧАСТИЧНО. Предупреждение о выключенном push есть в форме записи медкарты, в форме лекарства нет.</w:t>
+      </w:r>
+    </w:p>
+    <w:p>
+      <w:pPr>
+        <w:spacing w:after="60"/>
+      </w:pPr>
+      <w:r>
+        <w:rPr>
+          <w:b/>
         </w:rPr>
         <w:t xml:space="preserve">История. </w:t>
       </w:r>
@@ -11419,6 +11991,18 @@
       <w:r>
         <w:rPr>
           <w:b/>
+          <w:color w:val="8A5A00"/>
+        </w:rPr>
+        <w:t>ЧАСТИЧНО. Сохранение без связи падает сразу и честно; офлайн-очереди нет.</w:t>
+      </w:r>
+    </w:p>
+    <w:p>
+      <w:pPr>
+        <w:spacing w:after="60"/>
+      </w:pPr>
+      <w:r>
+        <w:rPr>
+          <w:b/>
         </w:rPr>
         <w:t xml:space="preserve">История. </w:t>
       </w:r>
@@ -11611,6 +12195,18 @@
       <w:r>
         <w:rPr>
           <w:b/>
+          <w:color w:val="8A5A00"/>
+        </w:rPr>
+        <w:t>ЧАСТИЧНО. Области нажатия 44 px добавлены; масштаб текста 200% отдельно не доводился.</w:t>
+      </w:r>
+    </w:p>
+    <w:p>
+      <w:pPr>
+        <w:spacing w:after="60"/>
+      </w:pPr>
+      <w:r>
+        <w:rPr>
+          <w:b/>
         </w:rPr>
         <w:t xml:space="preserve">История. </w:t>
       </w:r>
@@ -12003,6 +12599,18 @@
       <w:r>
         <w:rPr>
           <w:b/>
+          <w:color w:val="1E7A3C"/>
+        </w:rPr>
+        <w:t>ИСПРАВЛЕНО. У обработки по умолчанию повтор через 3 месяца, подсказка честная, запись без повтора помечена.</w:t>
+      </w:r>
+    </w:p>
+    <w:p>
+      <w:pPr>
+        <w:spacing w:after="60"/>
+      </w:pPr>
+      <w:r>
+        <w:rPr>
+          <w:b/>
         </w:rPr>
         <w:t xml:space="preserve">История. </w:t>
       </w:r>
@@ -12099,6 +12707,18 @@
       <w:r>
         <w:rPr>
           <w:b/>
+          <w:color w:val="1E7A3C"/>
+        </w:rPr>
+        <w:t>ИСПРАВЛЕНО. То же поле веса принимает запятую.</w:t>
+      </w:r>
+    </w:p>
+    <w:p>
+      <w:pPr>
+        <w:spacing w:after="60"/>
+      </w:pPr>
+      <w:r>
+        <w:rPr>
+          <w:b/>
         </w:rPr>
         <w:t xml:space="preserve">История. </w:t>
       </w:r>
@@ -12579,6 +13199,18 @@
       <w:r>
         <w:rPr>
           <w:b/>
+          <w:color w:val="1E7A3C"/>
+        </w:rPr>
+        <w:t>ИСПРАВЛЕНО. Полоса считает все просроченные записи, а не последние десять.</w:t>
+      </w:r>
+    </w:p>
+    <w:p>
+      <w:pPr>
+        <w:spacing w:after="60"/>
+      </w:pPr>
+      <w:r>
+        <w:rPr>
+          <w:b/>
         </w:rPr>
         <w:t xml:space="preserve">История. </w:t>
       </w:r>
@@ -12675,6 +13307,18 @@
       <w:r>
         <w:rPr>
           <w:b/>
+          <w:color w:val="8A5A00"/>
+        </w:rPr>
+        <w:t>ЧАСТИЧНО. Близкое название помечается до сохранения; автоматической замены нет.</w:t>
+      </w:r>
+    </w:p>
+    <w:p>
+      <w:pPr>
+        <w:spacing w:after="60"/>
+      </w:pPr>
+      <w:r>
+        <w:rPr>
+          <w:b/>
         </w:rPr>
         <w:t xml:space="preserve">История. </w:t>
       </w:r>
@@ -12771,6 +13415,18 @@
       <w:r>
         <w:rPr>
           <w:b/>
+          <w:color w:val="1E7A3C"/>
+        </w:rPr>
+        <w:t>ИСПРАВЛЕНО. Новая прививка с тем же названием гасит просроченный сертификат; кнопка полосы открывает форму без привязки старого файла.</w:t>
+      </w:r>
+    </w:p>
+    <w:p>
+      <w:pPr>
+        <w:spacing w:after="60"/>
+      </w:pPr>
+      <w:r>
+        <w:rPr>
+          <w:b/>
         </w:rPr>
         <w:t xml:space="preserve">История. </w:t>
       </w:r>
@@ -12867,6 +13523,18 @@
       <w:r>
         <w:rPr>
           <w:b/>
+          <w:color w:val="1E7A3C"/>
+        </w:rPr>
+        <w:t>ИСПРАВЛЕНО. Сертификат сохраняет срок и напоминание, пока у записи нет даты повтора.</w:t>
+      </w:r>
+    </w:p>
+    <w:p>
+      <w:pPr>
+        <w:spacing w:after="60"/>
+      </w:pPr>
+      <w:r>
+        <w:rPr>
+          <w:b/>
         </w:rPr>
         <w:t xml:space="preserve">История. </w:t>
       </w:r>
@@ -13347,6 +14015,18 @@
       <w:r>
         <w:rPr>
           <w:b/>
+          <w:color w:val="1E7A3C"/>
+        </w:rPr>
+        <w:t>ИСПРАВЛЕНО. Время документов показано по часам устройства.</w:t>
+      </w:r>
+    </w:p>
+    <w:p>
+      <w:pPr>
+        <w:spacing w:after="60"/>
+      </w:pPr>
+      <w:r>
+        <w:rPr>
+          <w:b/>
         </w:rPr>
         <w:t xml:space="preserve">История. </w:t>
       </w:r>
@@ -13635,6 +14315,18 @@
       <w:r>
         <w:rPr>
           <w:b/>
+          <w:color w:val="1E7A3C"/>
+        </w:rPr>
+        <w:t>ИСПРАВЛЕНО. Профиль версионируется: устаревшая форма получает 409 и показ актуальной версии.</w:t>
+      </w:r>
+    </w:p>
+    <w:p>
+      <w:pPr>
+        <w:spacing w:after="60"/>
+      </w:pPr>
+      <w:r>
+        <w:rPr>
+          <w:b/>
         </w:rPr>
         <w:t xml:space="preserve">История. </w:t>
       </w:r>
@@ -13923,6 +14615,18 @@
       <w:r>
         <w:rPr>
           <w:b/>
+          <w:color w:val="1E7A3C"/>
+        </w:rPr>
+        <w:t>ИСПРАВЛЕНО. Без связи сохранение падает сразу с понятным сообщением и не уходит позже.</w:t>
+      </w:r>
+    </w:p>
+    <w:p>
+      <w:pPr>
+        <w:spacing w:after="60"/>
+      </w:pPr>
+      <w:r>
+        <w:rPr>
+          <w:b/>
         </w:rPr>
         <w:t xml:space="preserve">История. </w:t>
       </w:r>
@@ -14115,6 +14819,18 @@
       <w:r>
         <w:rPr>
           <w:b/>
+          <w:color w:val="1E7A3C"/>
+        </w:rPr>
+        <w:t>ИСПРАВЛЕНО. Напоминания по датам идут после 9 утра по времени питомца.</w:t>
+      </w:r>
+    </w:p>
+    <w:p>
+      <w:pPr>
+        <w:spacing w:after="60"/>
+      </w:pPr>
+      <w:r>
+        <w:rPr>
+          <w:b/>
         </w:rPr>
         <w:t xml:space="preserve">История. </w:t>
       </w:r>
@@ -14211,6 +14927,18 @@
       <w:r>
         <w:rPr>
           <w:b/>
+          <w:color w:val="1E7A3C"/>
+        </w:rPr>
+        <w:t>ИСПРАВЛЕНО. Уведомление открывает карту нужного питомца в режиме «Вся карта».</w:t>
+      </w:r>
+    </w:p>
+    <w:p>
+      <w:pPr>
+        <w:spacing w:after="60"/>
+      </w:pPr>
+      <w:r>
+        <w:rPr>
+          <w:b/>
         </w:rPr>
         <w:t xml:space="preserve">История. </w:t>
       </w:r>
@@ -14307,6 +15035,18 @@
       <w:r>
         <w:rPr>
           <w:b/>
+          <w:color w:val="1E7A3C"/>
+        </w:rPr>
+        <w:t>ИСПРАВЛЕНО. Форма с датой повтора предупреждает, если на этом телефоне push выключен, и предлагает включить.</w:t>
+      </w:r>
+    </w:p>
+    <w:p>
+      <w:pPr>
+        <w:spacing w:after="60"/>
+      </w:pPr>
+      <w:r>
+        <w:rPr>
+          <w:b/>
         </w:rPr>
         <w:t xml:space="preserve">История. </w:t>
       </w:r>
@@ -14394,6 +15134,18 @@
           <w:sz w:val="19"/>
         </w:rPr>
         <w:t xml:space="preserve">   тяжесть S2, владелец, проверено живьём</w:t>
+      </w:r>
+    </w:p>
+    <w:p>
+      <w:pPr>
+        <w:spacing w:after="60"/>
+      </w:pPr>
+      <w:r>
+        <w:rPr>
+          <w:b/>
+          <w:color w:val="8A5A00"/>
+        </w:rPr>
+        <w:t>ЧАСТИЧНО. Области нажатия и фокус улучшены; чтение с экрана на устройстве не проверялось.</w:t>
       </w:r>
     </w:p>
     <w:p>

</xml_diff>

<commit_message>
docs: a checklist for the iPhone, audit notes after the WebKit run
</commit_message>
<xml_diff>
--- a/docs/ux-audit.docx
+++ b/docs/ux-audit.docx
@@ -9321,7 +9321,7 @@
           <w:b/>
           <w:color w:val="8A5A00"/>
         </w:rPr>
-        <w:t>ЧАСТИЧНО. Горизонтальной прокрутки нет, на 200% переключатели переносятся, заголовок диалога не наезжает на себя. Проверено подменой размера шрифта, настоящий крупный шрифт на телефоне не смотрели.</w:t>
+        <w:t>ЧАСТИЧНО. Горизонтальной прокрутки нет ни в Chrome, ни в WebKit (движок Safari) на размере iPhone 15 Pro и при шрифте 200%, переключатели переносятся, окно приёма прокручивается. Настоящий масштаб текста iOS не смотрели: чек-лист в docs/ios-checklist.md.</w:t>
       </w:r>
     </w:p>
     <w:p>
@@ -12617,7 +12617,7 @@
           <w:b/>
           <w:color w:val="8A5A00"/>
         </w:rPr>
-        <w:t>ЧАСТИЧНО. Диалог прокручивается внутри себя, цели нажатия 44 px. Настоящий крупный шрифт и чтение с экрана на телефоне не проверялись.</w:t>
+        <w:t>ЧАСТИЧНО. Диалог прокручивается внутри себя, цели нажатия 44 px, все наборы проходят в Chrome и в WebKit. Настоящий крупный шрифт и VoiceOver на телефоне не проверялись: docs/ios-checklist.md.</w:t>
       </w:r>
     </w:p>
     <w:p>
@@ -15625,7 +15625,7 @@
           <w:b/>
           <w:color w:val="8A5A00"/>
         </w:rPr>
-        <w:t>ЧАСТИЧНО. Метка строки записи называет срок и дату, переключатель выдерживает крупный текст. Чтение с экрана на телефоне не проверялось.</w:t>
+        <w:t>ЧАСТИЧНО. Метка строки записи называет срок и дату, переключатель выдерживает крупный текст, наборы проходят в WebKit. Чтение с экрана на телефоне не проверялось: docs/ios-checklist.md.</w:t>
       </w:r>
     </w:p>
     <w:p>

</xml_diff>